<commit_message>
Thêm file báo cáo Word
</commit_message>
<xml_diff>
--- a/ChuVanNam.docx
+++ b/ChuVanNam.docx
@@ -16,24 +16,7 @@
           <w:bCs/>
           <w:iCs/>
         </w:rPr>
-        <w:t>BẢN TÓM TẮT ĐỀ TÀI</w:t>
-      </w:r>
-    </w:p>
-    <w:p>
-      <w:pPr>
-        <w:rPr>
-          <w:b/>
-          <w:bCs/>
-          <w:iCs/>
-        </w:rPr>
-      </w:pPr>
-      <w:r>
-        <w:rPr>
-          <w:b/>
-          <w:bCs/>
-          <w:iCs/>
-        </w:rPr>
-        <w:t>WEBSITE BÁN HÀNG QUẦN ÁO – SHOP CLOTHING</w:t>
+        <w:t>WEBSITE BÁN HÀNG QUẦN ÁO SHOP CLOTHING</w:t>
       </w:r>
     </w:p>
     <w:p>
@@ -116,15 +99,7 @@
           <w:bCs/>
           <w:iCs/>
         </w:rPr>
-        <w:t xml:space="preserve"> website tham </w:t>
-      </w:r>
-      <w:r>
-        <w:rPr>
-          <w:b/>
-          <w:bCs/>
-          <w:iCs/>
-        </w:rPr>
-        <w:t>khảo</w:t>
+        <w:t xml:space="preserve"> website tham khảo</w:t>
       </w:r>
       <w:r>
         <w:rPr>
@@ -255,13 +230,7 @@
         <w:rPr>
           <w:iCs/>
         </w:rPr>
-        <w:t xml:space="preserve">Thông tin sản phẩm gồm tên sản phẩm, loại sản phẩm, nhãn hiệu, mô tả, chất liệu, giới tính và hình ảnh. Mỗi sản phẩm có thể có nhiều biến thể theo màu sắc và size. Mỗi biến thể có mã </w:t>
-      </w:r>
-      <w:r>
-        <w:rPr>
-          <w:iCs/>
-        </w:rPr>
-        <w:t>biến</w:t>
+        <w:t>Thông tin sản phẩm gồm tên sản phẩm, loại sản phẩm, nhãn hiệu, mô tả, chất liệu, giới tính và hình ảnh. Mỗi sản phẩm có thể có nhiều biến thể theo màu sắc và size. Mỗi biến thể có mã biến</w:t>
       </w:r>
       <w:r>
         <w:rPr>
@@ -343,7 +312,6 @@
           <w:bCs/>
           <w:iCs/>
         </w:rPr>
-        <w:lastRenderedPageBreak/>
         <w:t>4</w:t>
       </w:r>
       <w:r>
@@ -365,6 +333,7 @@
         <w:rPr>
           <w:iCs/>
         </w:rPr>
+        <w:lastRenderedPageBreak/>
         <w:t>Website hiển thị danh sách sản phẩm và thông tin chi tiết của từng sản phẩm như tên sản phẩm, hình ảnh, giá bán, màu sắc, size và số lượng còn trong kho.</w:t>
       </w:r>
     </w:p>
@@ -486,6 +455,7 @@
       <w:r>
         <w:rPr>
           <w:iCs/>
+          <w:noProof/>
         </w:rPr>
         <w:lastRenderedPageBreak/>
         <w:drawing>
@@ -1646,6 +1616,7 @@
   <w:style w:type="character" w:default="1" w:styleId="DefaultParagraphFont">
     <w:name w:val="Default Paragraph Font"/>
     <w:uiPriority w:val="1"/>
+    <w:semiHidden/>
     <w:unhideWhenUsed/>
   </w:style>
   <w:style w:type="table" w:default="1" w:styleId="TableNormal">

</xml_diff>